<commit_message>
fix(p4): ARZA signs «Hususy Telekeçi:» or «Direktor:» by legal form
The customs letter's signature line printed «Telekeçi <firm name>» for every
firm. It now reuses the contract's signer helpers: a sole proprietor (HT)
signs «Hususy Telekeçi: <person>», every other firm «Direktor: <director>».
customs_tk regenerated from build_templates.py (only the signature cells
changed).

Co-Authored-By: Claude Opus 5.5 <noreply@anthropic.com>
</commit_message>
<xml_diff>
--- a/backend/apps/contracts/document_templates/customs_tk.docx
+++ b/backend/apps/contracts/document_templates/customs_tk.docx
@@ -316,7 +316,7 @@
                 <w:i w:val="0"/>
                 <w:sz w:val="24"/>
               </w:rPr>
-              <w:t>Telekeçi</w:t>
+              <w:t>{{ signer_title }}:</w:t>
             </w:r>
           </w:p>
         </w:tc>
@@ -332,7 +332,7 @@
                 <w:i w:val="0"/>
                 <w:sz w:val="24"/>
               </w:rPr>
-              <w:t>{{ seller_name }}</w:t>
+              <w:t>{{ signer_name }}</w:t>
             </w:r>
           </w:p>
         </w:tc>

</xml_diff>